<commit_message>
Update docs page content
</commit_message>
<xml_diff>
--- a/packages/website/src/assets/sample.docx
+++ b/packages/website/src/assets/sample.docx
@@ -89,7 +89,7 @@
         <w:t>Added</w:t>
       </w:r>
       <w:r>
-        <w:t xml:space="preserve"> — new features, described in plain language.</w:t>
+        <w:t>: new features, described in plain language.</w:t>
       </w:r>
     </w:p>
     <w:p>
@@ -110,7 +110,7 @@
         <w:t>Changed</w:t>
       </w:r>
       <w:r>
-        <w:t xml:space="preserve"> — behaviour that works differently now.</w:t>
+        <w:t>: behaviour that works differently now.</w:t>
       </w:r>
     </w:p>
     <w:p>
@@ -131,7 +131,7 @@
         <w:t>Fixed</w:t>
       </w:r>
       <w:r>
-        <w:t xml:space="preserve"> — bugs, with enough detail that a reader can tell whether it affected them.</w:t>
+        <w:t>: bugs, with enough detail that a reader can tell whether it affected them.</w:t>
       </w:r>
     </w:p>
     <w:p>
@@ -284,12 +284,6 @@
       <w:r>
         <w:t xml:space="preserve"> format is a good place to start if you want a stricter template.</w:t>
       </w:r>
-    </w:p>
-    <w:p>
-      <w:pPr>
-        <w:spacing w:before="120" w:after="120"/>
-        <w:jc w:val="left"/>
-      </w:pPr>
     </w:p>
     <w:sectPr>
       <w:pgMar w:header="720" w:footer="720"/>

</xml_diff>